<commit_message>
create academic research folder
</commit_message>
<xml_diff>
--- a/MalwarePEDetection/TechnicalReports/NovelMethodsToDetectMalwares.draft11.docx
+++ b/MalwarePEDetection/TechnicalReports/NovelMethodsToDetectMalwares.draft11.docx
@@ -9549,7 +9549,9 @@
         </w:rPr>
         <w:t>Dataset Description</w:t>
       </w:r>
+      <w:bookmarkStart w:id="15" w:name="_GoBack"/>
       <w:bookmarkEnd w:id="14"/>
+      <w:bookmarkEnd w:id="15"/>
     </w:p>
     <w:p>
       <w:pPr>
@@ -9574,7 +9576,7 @@
         <w:rPr>
           <w:rFonts w:ascii="Times" w:hAnsi="Times" w:cs="MinionW08-Regular"/>
           <w:b/>
-          <w:color w:val="000000" w:themeColor="text1"/>
+          <w:color w:val="00B050"/>
           <w:sz w:val="22"/>
           <w:szCs w:val="22"/>
         </w:rPr>
@@ -9583,7 +9585,8 @@
       <w:r>
         <w:rPr>
           <w:rFonts w:ascii="Times" w:hAnsi="Times" w:cs="MinionW08-Regular"/>
-          <w:color w:val="000000" w:themeColor="text1"/>
+          <w:b/>
+          <w:color w:val="00B050"/>
           <w:sz w:val="22"/>
           <w:szCs w:val="22"/>
         </w:rPr>
@@ -9592,7 +9595,8 @@
       <w:r>
         <w:rPr>
           <w:rFonts w:ascii="Times" w:hAnsi="Times" w:cs="MinionW08-Regular"/>
-          <w:color w:val="000000" w:themeColor="text1"/>
+          <w:b/>
+          <w:color w:val="00B050"/>
           <w:sz w:val="22"/>
           <w:szCs w:val="22"/>
         </w:rPr>
@@ -9601,7 +9605,8 @@
       <w:r>
         <w:rPr>
           <w:rFonts w:ascii="Times" w:hAnsi="Times" w:cs="MinionW08-Regular"/>
-          <w:color w:val="000000" w:themeColor="text1"/>
+          <w:b/>
+          <w:color w:val="00B050"/>
           <w:sz w:val="22"/>
           <w:szCs w:val="22"/>
         </w:rPr>
@@ -9702,7 +9707,8 @@
       <w:r>
         <w:rPr>
           <w:rFonts w:ascii="Times" w:hAnsi="Times" w:cs="MinionW08-Regular"/>
-          <w:color w:val="000000" w:themeColor="text1"/>
+          <w:b/>
+          <w:color w:val="00B050"/>
           <w:sz w:val="22"/>
           <w:szCs w:val="22"/>
         </w:rPr>
@@ -9712,7 +9718,7 @@
         <w:rPr>
           <w:rFonts w:ascii="Times" w:hAnsi="Times" w:cs="MinionW08-Regular"/>
           <w:b/>
-          <w:color w:val="000000" w:themeColor="text1"/>
+          <w:color w:val="00B050"/>
           <w:sz w:val="22"/>
           <w:szCs w:val="22"/>
         </w:rPr>
@@ -9722,7 +9728,7 @@
         <w:rPr>
           <w:rFonts w:ascii="Times" w:hAnsi="Times" w:cs="MinionW08-Regular" w:hint="eastAsia"/>
           <w:b/>
-          <w:color w:val="000000" w:themeColor="text1"/>
+          <w:color w:val="00B050"/>
           <w:sz w:val="22"/>
           <w:szCs w:val="22"/>
         </w:rPr>
@@ -9731,11 +9737,21 @@
       <w:r>
         <w:rPr>
           <w:rFonts w:ascii="Times" w:hAnsi="Times" w:cs="MinionW08-Regular"/>
-          <w:color w:val="000000" w:themeColor="text1"/>
-          <w:sz w:val="22"/>
-          <w:szCs w:val="22"/>
-        </w:rPr>
-        <w:t>benign files from the W</w:t>
+          <w:b/>
+          <w:color w:val="00B050"/>
+          <w:sz w:val="22"/>
+          <w:szCs w:val="22"/>
+        </w:rPr>
+        <w:t>benign files</w:t>
+      </w:r>
+      <w:r>
+        <w:rPr>
+          <w:rFonts w:ascii="Times" w:hAnsi="Times" w:cs="MinionW08-Regular"/>
+          <w:color w:val="000000" w:themeColor="text1"/>
+          <w:sz w:val="22"/>
+          <w:szCs w:val="22"/>
+        </w:rPr>
+        <w:t xml:space="preserve"> from the W</w:t>
       </w:r>
       <w:r>
         <w:rPr>
@@ -9769,7 +9785,7 @@
           <w:szCs w:val="22"/>
         </w:rPr>
       </w:pPr>
-      <w:bookmarkStart w:id="15" w:name="_Toc491276030"/>
+      <w:bookmarkStart w:id="16" w:name="_Toc491276030"/>
       <w:r>
         <w:rPr>
           <w:rFonts w:ascii="Times" w:hAnsi="Times"/>
@@ -9827,7 +9843,7 @@
         </w:rPr>
         <w:t xml:space="preserve"> Diversity of Malware Dataset</w:t>
       </w:r>
-      <w:bookmarkEnd w:id="15"/>
+      <w:bookmarkEnd w:id="16"/>
     </w:p>
     <w:p>
       <w:pPr>
@@ -10043,7 +10059,7 @@
           <w:szCs w:val="22"/>
         </w:rPr>
       </w:pPr>
-      <w:bookmarkStart w:id="16" w:name="_Toc491281644"/>
+      <w:bookmarkStart w:id="17" w:name="_Toc491281644"/>
       <w:r>
         <w:rPr>
           <w:rFonts w:ascii="Times" w:hAnsi="Times"/>
@@ -10089,7 +10105,7 @@
         </w:rPr>
         <w:t>Extraction</w:t>
       </w:r>
-      <w:bookmarkEnd w:id="16"/>
+      <w:bookmarkEnd w:id="17"/>
     </w:p>
     <w:p>
       <w:pPr>
@@ -10221,7 +10237,7 @@
           <w:szCs w:val="22"/>
         </w:rPr>
       </w:pPr>
-      <w:bookmarkStart w:id="17" w:name="_Toc491276031"/>
+      <w:bookmarkStart w:id="18" w:name="_Toc491276031"/>
       <w:r>
         <w:rPr>
           <w:rFonts w:ascii="Times" w:hAnsi="Times"/>
@@ -10287,7 +10303,7 @@
         </w:rPr>
         <w:t>malware samples</w:t>
       </w:r>
-      <w:bookmarkEnd w:id="17"/>
+      <w:bookmarkEnd w:id="18"/>
     </w:p>
     <w:tbl>
       <w:tblPr>
@@ -11295,8 +11311,8 @@
                 <w:szCs w:val="22"/>
               </w:rPr>
             </w:pPr>
-            <w:bookmarkStart w:id="18" w:name="OLE_LINK1"/>
-            <w:bookmarkStart w:id="19" w:name="OLE_LINK2"/>
+            <w:bookmarkStart w:id="19" w:name="OLE_LINK1"/>
+            <w:bookmarkStart w:id="20" w:name="OLE_LINK2"/>
             <w:r>
               <w:rPr>
                 <w:rFonts w:ascii="Times" w:eastAsia="Times New Roman" w:hAnsi="Times" w:cs="Times New Roman"/>
@@ -11326,8 +11342,8 @@
               </w:rPr>
               <w:t xml:space="preserve"> Data</w:t>
             </w:r>
-            <w:bookmarkEnd w:id="18"/>
             <w:bookmarkEnd w:id="19"/>
+            <w:bookmarkEnd w:id="20"/>
           </w:p>
         </w:tc>
         <w:tc>
@@ -12943,7 +12959,7 @@
           <w:szCs w:val="22"/>
         </w:rPr>
       </w:pPr>
-      <w:bookmarkStart w:id="20" w:name="_Toc491276032"/>
+      <w:bookmarkStart w:id="21" w:name="_Toc491276032"/>
       <w:r>
         <w:rPr>
           <w:rFonts w:ascii="Times" w:hAnsi="Times"/>
@@ -13001,7 +13017,7 @@
         </w:rPr>
         <w:t xml:space="preserve"> Lists of API function calls into groups</w:t>
       </w:r>
-      <w:bookmarkEnd w:id="20"/>
+      <w:bookmarkEnd w:id="21"/>
     </w:p>
     <w:tbl>
       <w:tblPr>
@@ -14044,8 +14060,8 @@
           <w:szCs w:val="22"/>
         </w:rPr>
       </w:pPr>
-      <w:bookmarkStart w:id="21" w:name="OLE_LINK3"/>
-      <w:bookmarkStart w:id="22" w:name="OLE_LINK4"/>
+      <w:bookmarkStart w:id="22" w:name="OLE_LINK3"/>
+      <w:bookmarkStart w:id="23" w:name="OLE_LINK4"/>
       <w:proofErr w:type="spellStart"/>
       <w:r>
         <w:rPr>
@@ -14056,8 +14072,8 @@
         </w:rPr>
         <w:t>CreateRemoteThread</w:t>
       </w:r>
-      <w:bookmarkEnd w:id="21"/>
       <w:bookmarkEnd w:id="22"/>
+      <w:bookmarkEnd w:id="23"/>
       <w:proofErr w:type="spellEnd"/>
     </w:p>
     <w:p>
@@ -14596,8 +14612,8 @@
           <w:szCs w:val="22"/>
         </w:rPr>
       </w:pPr>
-      <w:bookmarkStart w:id="23" w:name="OLE_LINK14"/>
-      <w:bookmarkStart w:id="24" w:name="OLE_LINK15"/>
+      <w:bookmarkStart w:id="24" w:name="OLE_LINK14"/>
+      <w:bookmarkStart w:id="25" w:name="OLE_LINK15"/>
       <w:r>
         <w:rPr>
           <w:rFonts w:ascii="Times" w:hAnsi="Times" w:cs="MinionW08-Regular"/>
@@ -14897,8 +14913,8 @@
         </w:rPr>
         <w:t xml:space="preserve"> etc.</w:t>
       </w:r>
-      <w:bookmarkEnd w:id="23"/>
       <w:bookmarkEnd w:id="24"/>
+      <w:bookmarkEnd w:id="25"/>
     </w:p>
     <w:p>
       <w:pPr>
@@ -15513,7 +15529,7 @@
           <w:szCs w:val="22"/>
         </w:rPr>
       </w:pPr>
-      <w:bookmarkStart w:id="25" w:name="_Toc491276033"/>
+      <w:bookmarkStart w:id="26" w:name="_Toc491276033"/>
       <w:r>
         <w:rPr>
           <w:rFonts w:ascii="Times" w:hAnsi="Times"/>
@@ -15571,7 +15587,7 @@
         </w:rPr>
         <w:t xml:space="preserve"> Raw features extracted from PE header</w:t>
       </w:r>
-      <w:bookmarkEnd w:id="25"/>
+      <w:bookmarkEnd w:id="26"/>
     </w:p>
     <w:tbl>
       <w:tblPr>
@@ -16711,7 +16727,7 @@
           <w:szCs w:val="22"/>
         </w:rPr>
       </w:pPr>
-      <w:bookmarkStart w:id="26" w:name="_Toc491281645"/>
+      <w:bookmarkStart w:id="27" w:name="_Toc491281645"/>
       <w:r>
         <w:rPr>
           <w:rFonts w:ascii="Times" w:hAnsi="Times"/>
@@ -16721,7 +16737,7 @@
         </w:rPr>
         <w:t>Model Selection&amp; Parameter Tuning</w:t>
       </w:r>
-      <w:bookmarkEnd w:id="26"/>
+      <w:bookmarkEnd w:id="27"/>
     </w:p>
     <w:p>
       <w:pPr>
@@ -17499,7 +17515,7 @@
           <w:szCs w:val="22"/>
         </w:rPr>
       </w:pPr>
-      <w:bookmarkStart w:id="27" w:name="_Toc491276034"/>
+      <w:bookmarkStart w:id="28" w:name="_Toc491276034"/>
       <w:r>
         <w:rPr>
           <w:rFonts w:ascii="Times" w:hAnsi="Times"/>
@@ -17573,7 +17589,7 @@
         </w:rPr>
         <w:t>arameters</w:t>
       </w:r>
-      <w:bookmarkEnd w:id="27"/>
+      <w:bookmarkEnd w:id="28"/>
     </w:p>
     <w:p>
       <w:pPr>
@@ -17905,7 +17921,7 @@
           <w:szCs w:val="22"/>
         </w:rPr>
       </w:pPr>
-      <w:bookmarkStart w:id="28" w:name="_Toc491281646"/>
+      <w:bookmarkStart w:id="29" w:name="_Toc491281646"/>
       <w:r>
         <w:rPr>
           <w:rFonts w:ascii="Times" w:hAnsi="Times"/>
@@ -17953,7 +17969,7 @@
         </w:rPr>
         <w:t xml:space="preserve"> model fixed)</w:t>
       </w:r>
-      <w:bookmarkEnd w:id="28"/>
+      <w:bookmarkEnd w:id="29"/>
     </w:p>
     <w:p>
       <w:pPr>
@@ -18084,7 +18100,7 @@
           <w:szCs w:val="22"/>
         </w:rPr>
       </w:pPr>
-      <w:bookmarkStart w:id="29" w:name="_Toc491276035"/>
+      <w:bookmarkStart w:id="30" w:name="_Toc491276035"/>
       <w:r>
         <w:rPr>
           <w:rFonts w:ascii="Times" w:hAnsi="Times"/>
@@ -18142,7 +18158,7 @@
         </w:rPr>
         <w:t xml:space="preserve"> Important analysis of features</w:t>
       </w:r>
-      <w:bookmarkEnd w:id="29"/>
+      <w:bookmarkEnd w:id="30"/>
     </w:p>
     <w:p>
       <w:pPr>
@@ -18287,7 +18303,7 @@
           <w:szCs w:val="22"/>
         </w:rPr>
       </w:pPr>
-      <w:bookmarkStart w:id="30" w:name="_Toc491276036"/>
+      <w:bookmarkStart w:id="31" w:name="_Toc491276036"/>
       <w:r>
         <w:rPr>
           <w:rFonts w:ascii="Times" w:hAnsi="Times"/>
@@ -18345,7 +18361,7 @@
         </w:rPr>
         <w:t xml:space="preserve"> Descriptions of some important features</w:t>
       </w:r>
-      <w:bookmarkEnd w:id="30"/>
+      <w:bookmarkEnd w:id="31"/>
     </w:p>
     <w:tbl>
       <w:tblPr>
@@ -18476,8 +18492,8 @@
                 <w:szCs w:val="22"/>
               </w:rPr>
             </w:pPr>
-            <w:bookmarkStart w:id="31" w:name="OLE_LINK18"/>
-            <w:bookmarkStart w:id="32" w:name="OLE_LINK19"/>
+            <w:bookmarkStart w:id="32" w:name="OLE_LINK18"/>
+            <w:bookmarkStart w:id="33" w:name="OLE_LINK19"/>
             <w:r>
               <w:rPr>
                 <w:rFonts w:ascii="Times" w:hAnsi="Times" w:cs="MinionW08-Regular"/>
@@ -18487,8 +18503,8 @@
               </w:rPr>
               <w:t>Denotes the size of the debug-directory table</w:t>
             </w:r>
-            <w:bookmarkEnd w:id="31"/>
             <w:bookmarkEnd w:id="32"/>
+            <w:bookmarkEnd w:id="33"/>
             <w:r>
               <w:rPr>
                 <w:rFonts w:ascii="Times" w:hAnsi="Times" w:cs="MinionW08-Regular"/>
@@ -18562,8 +18578,8 @@
                 <w:szCs w:val="22"/>
               </w:rPr>
             </w:pPr>
-            <w:bookmarkStart w:id="33" w:name="OLE_LINK22"/>
-            <w:bookmarkStart w:id="34" w:name="OLE_LINK23"/>
+            <w:bookmarkStart w:id="34" w:name="OLE_LINK22"/>
+            <w:bookmarkStart w:id="35" w:name="OLE_LINK23"/>
             <w:r>
               <w:rPr>
                 <w:rFonts w:ascii="Times" w:hAnsi="Times" w:cs="MinionW08-Regular"/>
@@ -18613,8 +18629,8 @@
               </w:rPr>
               <w:t xml:space="preserve"> value than malware, which means benign file has more detail description about the file.</w:t>
             </w:r>
-            <w:bookmarkEnd w:id="33"/>
             <w:bookmarkEnd w:id="34"/>
+            <w:bookmarkEnd w:id="35"/>
           </w:p>
         </w:tc>
       </w:tr>
@@ -18742,9 +18758,9 @@
                 <w:szCs w:val="22"/>
               </w:rPr>
             </w:pPr>
-            <w:bookmarkStart w:id="35" w:name="OLE_LINK5"/>
-            <w:bookmarkStart w:id="36" w:name="OLE_LINK6"/>
-            <w:bookmarkStart w:id="37" w:name="OLE_LINK11"/>
+            <w:bookmarkStart w:id="36" w:name="OLE_LINK5"/>
+            <w:bookmarkStart w:id="37" w:name="OLE_LINK6"/>
+            <w:bookmarkStart w:id="38" w:name="OLE_LINK11"/>
             <w:proofErr w:type="spellStart"/>
             <w:r>
               <w:rPr>
@@ -18756,9 +18772,9 @@
               </w:rPr>
               <w:t>RT_maniFest</w:t>
             </w:r>
-            <w:bookmarkEnd w:id="35"/>
             <w:bookmarkEnd w:id="36"/>
             <w:bookmarkEnd w:id="37"/>
+            <w:bookmarkEnd w:id="38"/>
             <w:proofErr w:type="spellEnd"/>
           </w:p>
         </w:tc>
@@ -18946,8 +18962,8 @@
                 <w:szCs w:val="22"/>
               </w:rPr>
             </w:pPr>
-            <w:bookmarkStart w:id="38" w:name="OLE_LINK9"/>
-            <w:bookmarkStart w:id="39" w:name="OLE_LINK10"/>
+            <w:bookmarkStart w:id="39" w:name="OLE_LINK9"/>
+            <w:bookmarkStart w:id="40" w:name="OLE_LINK10"/>
             <w:proofErr w:type="spellStart"/>
             <w:r>
               <w:rPr>
@@ -18959,8 +18975,8 @@
               </w:rPr>
               <w:t>NumberOfSymbols</w:t>
             </w:r>
-            <w:bookmarkEnd w:id="38"/>
             <w:bookmarkEnd w:id="39"/>
+            <w:bookmarkEnd w:id="40"/>
             <w:proofErr w:type="spellEnd"/>
           </w:p>
         </w:tc>
@@ -19069,8 +19085,8 @@
               </w:rPr>
               <w:t>initterm&amp;</w:t>
             </w:r>
-            <w:bookmarkStart w:id="40" w:name="OLE_LINK7"/>
-            <w:bookmarkStart w:id="41" w:name="OLE_LINK8"/>
+            <w:bookmarkStart w:id="41" w:name="OLE_LINK7"/>
+            <w:bookmarkStart w:id="42" w:name="OLE_LINK8"/>
             <w:r>
               <w:rPr>
                 <w:rFonts w:ascii="Times" w:hAnsi="Times" w:cs="MinionW08-Regular"/>
@@ -19081,8 +19097,8 @@
               </w:rPr>
               <w:t>UnhandleExceptionFilter</w:t>
             </w:r>
-            <w:bookmarkEnd w:id="40"/>
             <w:bookmarkEnd w:id="41"/>
+            <w:bookmarkEnd w:id="42"/>
             <w:proofErr w:type="spellEnd"/>
           </w:p>
         </w:tc>
@@ -19142,7 +19158,7 @@
           <w:szCs w:val="22"/>
         </w:rPr>
       </w:pPr>
-      <w:bookmarkStart w:id="42" w:name="_Toc491281647"/>
+      <w:bookmarkStart w:id="43" w:name="_Toc491281647"/>
       <w:r>
         <w:rPr>
           <w:rFonts w:ascii="Times" w:hAnsi="Times"/>
@@ -19152,7 +19168,7 @@
         </w:rPr>
         <w:t>Results</w:t>
       </w:r>
-      <w:bookmarkEnd w:id="42"/>
+      <w:bookmarkEnd w:id="43"/>
     </w:p>
     <w:p>
       <w:pPr>
@@ -19511,7 +19527,7 @@
           <w:szCs w:val="22"/>
         </w:rPr>
       </w:pPr>
-      <w:bookmarkStart w:id="43" w:name="_Toc491276037"/>
+      <w:bookmarkStart w:id="44" w:name="_Toc491276037"/>
       <w:r>
         <w:rPr>
           <w:rFonts w:ascii="Times" w:hAnsi="Times"/>
@@ -19569,7 +19585,7 @@
         </w:rPr>
         <w:t xml:space="preserve"> Confusion Matrix &amp; Detection Rate</w:t>
       </w:r>
-      <w:bookmarkEnd w:id="43"/>
+      <w:bookmarkEnd w:id="44"/>
     </w:p>
     <w:tbl>
       <w:tblPr>
@@ -19895,7 +19911,8 @@
               <w:jc w:val="center"/>
               <w:rPr>
                 <w:rFonts w:ascii="Times" w:hAnsi="Times" w:cs="MinionW08-Regular"/>
-                <w:color w:val="000000" w:themeColor="text1"/>
+                <w:b/>
+                <w:color w:val="00B050"/>
                 <w:sz w:val="22"/>
                 <w:szCs w:val="22"/>
               </w:rPr>
@@ -19903,7 +19920,8 @@
             <w:r>
               <w:rPr>
                 <w:rFonts w:ascii="Times" w:hAnsi="Times" w:cs="MinionW08-Regular"/>
-                <w:color w:val="000000" w:themeColor="text1"/>
+                <w:b/>
+                <w:color w:val="00B050"/>
                 <w:sz w:val="22"/>
                 <w:szCs w:val="22"/>
               </w:rPr>
@@ -19912,7 +19930,8 @@
             <w:r>
               <w:rPr>
                 <w:rFonts w:ascii="Times" w:hAnsi="Times" w:cs="MinionW08-Regular"/>
-                <w:color w:val="000000" w:themeColor="text1"/>
+                <w:b/>
+                <w:color w:val="00B050"/>
                 <w:sz w:val="22"/>
                 <w:szCs w:val="22"/>
               </w:rPr>
@@ -19949,7 +19968,7 @@
           <w:u w:color="243778"/>
         </w:rPr>
       </w:pPr>
-      <w:bookmarkStart w:id="44" w:name="_Toc491276038"/>
+      <w:bookmarkStart w:id="45" w:name="_Toc491276038"/>
       <w:r>
         <w:rPr>
           <w:rFonts w:ascii="Times" w:hAnsi="Times"/>
@@ -20007,7 +20026,7 @@
         </w:rPr>
         <w:t xml:space="preserve"> The ROC curve</w:t>
       </w:r>
-      <w:bookmarkEnd w:id="44"/>
+      <w:bookmarkEnd w:id="45"/>
     </w:p>
     <w:p>
       <w:pPr>
@@ -20105,7 +20124,7 @@
           <w:szCs w:val="22"/>
         </w:rPr>
       </w:pPr>
-      <w:bookmarkStart w:id="45" w:name="_Toc491276039"/>
+      <w:bookmarkStart w:id="46" w:name="_Toc491276039"/>
       <w:r>
         <w:rPr>
           <w:rFonts w:ascii="Times" w:hAnsi="Times"/>
@@ -20181,7 +20200,7 @@
         </w:rPr>
         <w:t>. &amp; combination of features</w:t>
       </w:r>
-      <w:bookmarkEnd w:id="45"/>
+      <w:bookmarkEnd w:id="46"/>
     </w:p>
     <w:tbl>
       <w:tblPr>
@@ -21809,7 +21828,7 @@
           <w:szCs w:val="22"/>
         </w:rPr>
       </w:pPr>
-      <w:bookmarkStart w:id="46" w:name="_Toc491281648"/>
+      <w:bookmarkStart w:id="47" w:name="_Toc491281648"/>
       <w:r>
         <w:rPr>
           <w:rFonts w:ascii="Times" w:hAnsi="Times"/>
@@ -21837,7 +21856,7 @@
         </w:rPr>
         <w:t>related static methods</w:t>
       </w:r>
-      <w:bookmarkEnd w:id="46"/>
+      <w:bookmarkEnd w:id="47"/>
     </w:p>
     <w:p>
       <w:pPr>
@@ -22478,7 +22497,7 @@
           <w:szCs w:val="22"/>
         </w:rPr>
       </w:pPr>
-      <w:bookmarkStart w:id="47" w:name="_Toc491281649"/>
+      <w:bookmarkStart w:id="48" w:name="_Toc491281649"/>
       <w:r>
         <w:rPr>
           <w:rFonts w:ascii="Times" w:hAnsi="Times"/>
@@ -22495,7 +22514,7 @@
         </w:rPr>
         <w:t>s</w:t>
       </w:r>
-      <w:bookmarkEnd w:id="47"/>
+      <w:bookmarkEnd w:id="48"/>
     </w:p>
     <w:p>
       <w:pPr>
@@ -23103,7 +23122,7 @@
         </w:rPr>
       </w:pPr>
     </w:p>
-    <w:bookmarkStart w:id="48" w:name="_Toc491281650" w:displacedByCustomXml="next"/>
+    <w:bookmarkStart w:id="49" w:name="_Toc491281650" w:displacedByCustomXml="next"/>
     <w:sdt>
       <w:sdtPr>
         <w:rPr>
@@ -23137,7 +23156,7 @@
             </w:rPr>
             <w:t>Bibliography</w:t>
           </w:r>
-          <w:bookmarkEnd w:id="48"/>
+          <w:bookmarkEnd w:id="49"/>
         </w:p>
         <w:sdt>
           <w:sdtPr>
@@ -23262,8 +23281,6 @@
                         <w:noProof/>
                       </w:rPr>
                     </w:pPr>
-                    <w:bookmarkStart w:id="49" w:name="_GoBack"/>
-                    <w:bookmarkEnd w:id="49"/>
                     <w:r>
                       <w:rPr>
                         <w:noProof/>
@@ -29063,7 +29080,7 @@
 </file>
 
 <file path=customXml/itemProps1.xml><?xml version="1.0" encoding="utf-8"?>
-<ds:datastoreItem xmlns:ds="http://schemas.openxmlformats.org/officeDocument/2006/customXml" ds:itemID="{205380FD-EF24-D046-A744-3CBD92E1AB50}">
+<ds:datastoreItem xmlns:ds="http://schemas.openxmlformats.org/officeDocument/2006/customXml" ds:itemID="{1AE32C63-7A29-6440-A143-CBE0A7D338BF}">
   <ds:schemaRefs>
     <ds:schemaRef ds:uri="http://schemas.openxmlformats.org/officeDocument/2006/bibliography"/>
   </ds:schemaRefs>

</xml_diff>